<commit_message>
Figuras no tamanho certo: 16,2 cm numa área de texto de 17
Dois erros de medida, um em cima do outro.

O div da figura era de bloco e enchia a largura da janela, então cada PNG saía
com uma faixa branca de 36% à direita — a figura ocupava pouco mais da metade
da imagem. Passou a inline-block, que é do tamanho do desenho.

E a conta da escala tratava a medida do docx como ponto. Não é: a biblioteca
mede em pixel de 96 dpi, 1 px = 0,75 pt. Por isso as figuras saíam a 12 cm.
As constantes agora dizem a unidade no nome, e a conta desconta o fator 3 da
renderização.

Resultado medido no .docx: figura de página inteira a 16,2 cm, numa área de
texto de 17,0 cm; as dos movimentos de solfejo a 9,7 cm.

Co-Authored-By: Claude Opus 5 <noreply@anthropic.com>
Claude-Session: https://claude.ai/code/session_014Qv8vUa47sQ8agnYCob2NZ
</commit_message>
<xml_diff>
--- a/apostila/Apostila-1o-periodo-candidato.docx
+++ b/apostila/Apostila-1o-periodo-candidato.docx
@@ -2698,7 +2698,7 @@
       <w:r>
         <w:drawing>
           <wp:inline distT="0" distB="0" distL="0" distR="0">
-            <wp:extent cx="4476750" cy="666750"/>
+            <wp:extent cx="5848350" cy="1362075"/>
             <wp:effectExtent t="0" r="0" b="0" l="0"/>
             <wp:docPr id="1" name="" descr="" title=""/>
             <wp:cNvGraphicFramePr>
@@ -2723,7 +2723,7 @@
                   <pic:spPr bwMode="auto">
                     <a:xfrm>
                       <a:off x="0" y="0"/>
-                      <a:ext cx="4476750" cy="666750"/>
+                      <a:ext cx="5848350" cy="1362075"/>
                     </a:xfrm>
                     <a:prstGeom prst="rect">
                       <a:avLst/>
@@ -2774,7 +2774,7 @@
       <w:r>
         <w:drawing>
           <wp:inline distT="0" distB="0" distL="0" distR="0">
-            <wp:extent cx="4476750" cy="2085975"/>
+            <wp:extent cx="5848350" cy="4267200"/>
             <wp:effectExtent t="0" r="0" b="0" l="0"/>
             <wp:docPr id="1" name="" descr="" title=""/>
             <wp:cNvGraphicFramePr>
@@ -2799,7 +2799,7 @@
                   <pic:spPr bwMode="auto">
                     <a:xfrm>
                       <a:off x="0" y="0"/>
-                      <a:ext cx="4476750" cy="2085975"/>
+                      <a:ext cx="5848350" cy="4267200"/>
                     </a:xfrm>
                     <a:prstGeom prst="rect">
                       <a:avLst/>
@@ -3614,7 +3614,7 @@
       <w:r>
         <w:drawing>
           <wp:inline distT="0" distB="0" distL="0" distR="0">
-            <wp:extent cx="4476750" cy="3057525"/>
+            <wp:extent cx="5848350" cy="6257925"/>
             <wp:effectExtent t="0" r="0" b="0" l="0"/>
             <wp:docPr id="1" name="" descr="" title=""/>
             <wp:cNvGraphicFramePr>
@@ -3639,7 +3639,7 @@
                   <pic:spPr bwMode="auto">
                     <a:xfrm>
                       <a:off x="0" y="0"/>
-                      <a:ext cx="4476750" cy="3057525"/>
+                      <a:ext cx="5848350" cy="6257925"/>
                     </a:xfrm>
                     <a:prstGeom prst="rect">
                       <a:avLst/>
@@ -5410,7 +5410,7 @@
       <w:r>
         <w:drawing>
           <wp:inline distT="0" distB="0" distL="0" distR="0">
-            <wp:extent cx="4476750" cy="942975"/>
+            <wp:extent cx="5848350" cy="1924050"/>
             <wp:effectExtent t="0" r="0" b="0" l="0"/>
             <wp:docPr id="1" name="" descr="" title=""/>
             <wp:cNvGraphicFramePr>
@@ -5435,7 +5435,7 @@
                   <pic:spPr bwMode="auto">
                     <a:xfrm>
                       <a:off x="0" y="0"/>
-                      <a:ext cx="4476750" cy="942975"/>
+                      <a:ext cx="5848350" cy="1924050"/>
                     </a:xfrm>
                     <a:prstGeom prst="rect">
                       <a:avLst/>
@@ -7593,7 +7593,7 @@
       <w:r>
         <w:drawing>
           <wp:inline distT="0" distB="0" distL="0" distR="0">
-            <wp:extent cx="4476750" cy="1276350"/>
+            <wp:extent cx="5848350" cy="2619375"/>
             <wp:effectExtent t="0" r="0" b="0" l="0"/>
             <wp:docPr id="1" name="" descr="" title=""/>
             <wp:cNvGraphicFramePr>
@@ -7618,7 +7618,7 @@
                   <pic:spPr bwMode="auto">
                     <a:xfrm>
                       <a:off x="0" y="0"/>
-                      <a:ext cx="4476750" cy="1276350"/>
+                      <a:ext cx="5848350" cy="2619375"/>
                     </a:xfrm>
                     <a:prstGeom prst="rect">
                       <a:avLst/>
@@ -7669,7 +7669,7 @@
       <w:r>
         <w:drawing>
           <wp:inline distT="0" distB="0" distL="0" distR="0">
-            <wp:extent cx="4476750" cy="1238250"/>
+            <wp:extent cx="5848350" cy="2533650"/>
             <wp:effectExtent t="0" r="0" b="0" l="0"/>
             <wp:docPr id="1" name="" descr="" title=""/>
             <wp:cNvGraphicFramePr>
@@ -7694,7 +7694,7 @@
                   <pic:spPr bwMode="auto">
                     <a:xfrm>
                       <a:off x="0" y="0"/>
-                      <a:ext cx="4476750" cy="1238250"/>
+                      <a:ext cx="5848350" cy="2533650"/>
                     </a:xfrm>
                     <a:prstGeom prst="rect">
                       <a:avLst/>
@@ -9838,7 +9838,7 @@
       <w:r>
         <w:drawing>
           <wp:inline distT="0" distB="0" distL="0" distR="0">
-            <wp:extent cx="4476750" cy="1247775"/>
+            <wp:extent cx="3476625" cy="2543175"/>
             <wp:effectExtent t="0" r="0" b="0" l="0"/>
             <wp:docPr id="1" name="" descr="" title=""/>
             <wp:cNvGraphicFramePr>
@@ -9863,7 +9863,7 @@
                   <pic:spPr bwMode="auto">
                     <a:xfrm>
                       <a:off x="0" y="0"/>
-                      <a:ext cx="4476750" cy="1247775"/>
+                      <a:ext cx="3476625" cy="2543175"/>
                     </a:xfrm>
                     <a:prstGeom prst="rect">
                       <a:avLst/>

</xml_diff>